<commit_message>
Restore A1 evidence cells and align the scope statement with the notebook.
Keep M4 fallback on 25 Sep and name alert/watch/null as an illustrative method example, not a firm rating.

Co-authored-by: Cursor <cursoragent@cursor.com>
</commit_message>
<xml_diff>
--- a/docs/assignment1/Group9_CAM_EP_Assignment1_v0.1.docx
+++ b/docs/assignment1/Group9_CAM_EP_Assignment1_v0.1.docx
@@ -333,7 +333,7 @@
           <w:highlight w:val="yellow"/>
           <w:rtl w:val="0"/>
         </w:rPr>
-        <w:t xml:space="preserve">1027</w:t>
+        <w:t xml:space="preserve">1051</w:t>
       </w:r>
       <w:r>
         <w:rPr>
@@ -3500,7 +3500,7 @@
           <w:szCs w:val="22"/>
           <w:rtl w:val="0"/>
         </w:rPr>
-        <w:t xml:space="preserve"> quarters of publicly available earnings-call transcripts and results statements.  Within that corpus we separate the management presentation from the analyst question-and-answer session, attribute speaker turns, extract numeric claims, measure topic and sentiment, map topics to prudential risk categories, and produce a comparable state summary for each bank-quarter. Excluded are non-public regulatory data, audio and webcast processing, macroeconomic forecasting, historical stress-scenario modelling, agentic external search, live streaming analysis and model distillation.  We also exclude any conclusion about either firm's actual prudential condition: the deliverable is a method and the evidence it produces, not a supervisory judgement.</w:t>
+        <w:t xml:space="preserve"> quarters of publicly available earnings-call transcripts and results statements.  Within that corpus we separate the management presentation from the analyst question-and-answer session, attribute speaker turns, extract numeric claims, measure topic and sentiment, map topics to prudential risk categories, and produce a comparable state summary for each bank-quarter. Excluded are non-public regulatory data, audio and webcast processing, macroeconomic forecasting, historical stress-scenario modelling, agentic external search, live streaming analysis and model distillation.  We also exclude any conclusion about either firm's actual prudential condition: the deliverable is a method and the evidence it produces, not a supervisory judgement. An alert / watch / null protocol on one bank-quarter is included only as an illustrative worked example of that method.</w:t>
       </w:r>
       <w:r>
         <w:rPr>
@@ -5206,7 +5206,7 @@
                 <w:szCs w:val="18"/>
                 <w:rtl w:val="0"/>
               </w:rPr>
-              <w:t xml:space="preserve">Unstable clusters: fall back to the seeded keyword taxonomy. Decision point fixed on this date.</w:t>
+              <w:t xml:space="preserve">Unstable clusters: fall back to the seeded keyword taxonomy. Decision point fixed on 25 September.</w:t>
             </w:r>
             <w:r>
               <w:rPr>
@@ -6819,7 +6819,7 @@
                 <w:szCs w:val="18"/>
                 <w:rtl w:val="0"/>
               </w:rPr>
-              <w:t xml:space="preserve">Fall back to a seeded keyword taxonomy derived from the prudential categories, which guarantees an interpretable result. The decision point is fixed at 26 September so the fallback still leaves time.</w:t>
+              <w:t xml:space="preserve">Fall back to a seeded keyword taxonomy derived from the prudential categories, which guarantees an interpretable result. The decision point is fixed at 25 September so the fallback still leaves time.</w:t>
             </w:r>
             <w:r>
               <w:rPr>

</xml_diff>